<commit_message>
Updated CV and About with Awards sections
</commit_message>
<xml_diff>
--- a/public/cv/CV_RohanDhamdhere_Spring2026.docx
+++ b/public/cv/CV_RohanDhamdhere_Spring2026.docx
@@ -2,7 +2,7 @@
 <file path=word/document.xml><?xml version="1.0" encoding="utf-8"?>
 <w:document xmlns:w="http://schemas.openxmlformats.org/wordprocessingml/2006/main" xmlns:m="http://schemas.openxmlformats.org/officeDocument/2006/math" xmlns:r="http://schemas.openxmlformats.org/officeDocument/2006/relationships" xmlns:o="urn:schemas-microsoft-com:office:office" xmlns:v="urn:schemas-microsoft-com:vml" xmlns:w10="urn:schemas-microsoft-com:office:word" xmlns:a="http://schemas.openxmlformats.org/drawingml/2006/main" xmlns:pic="http://schemas.openxmlformats.org/drawingml/2006/picture" xmlns:wp="http://schemas.openxmlformats.org/drawingml/2006/wordprocessingDrawing">
   <w:body>
-    <w:bookmarkStart w:id="23" w:name="rohan-n.-dhamdhere"/>
+    <w:bookmarkStart w:id="24" w:name="rohan-n.-dhamdhere"/>
     <w:p>
       <w:pPr>
         <w:pStyle w:val="Heading1"/>
@@ -205,12 +205,110 @@
       </w:r>
     </w:p>
     <w:bookmarkEnd w:id="14"/>
-    <w:bookmarkStart w:id="15" w:name="research-appointments"/>
+    <w:bookmarkStart w:id="15" w:name="awards-and-honors"/>
     <w:p>
       <w:pPr>
         <w:pStyle w:val="Heading2"/>
       </w:pPr>
       <w:r>
+        <w:t xml:space="preserve">Awards and Honors</w:t>
+      </w:r>
+    </w:p>
+    <w:p>
+      <w:pPr>
+        <w:pStyle w:val="Compact"/>
+        <w:numPr>
+          <w:ilvl w:val="0"/>
+          <w:numId w:val="1001"/>
+        </w:numPr>
+      </w:pPr>
+      <w:r>
+        <w:rPr>
+          <w:b/>
+          <w:bCs/>
+        </w:rPr>
+        <w:t xml:space="preserve">Outstanding Departmental Service Award:</w:t>
+      </w:r>
+      <w:r>
+        <w:t xml:space="preserve"> </w:t>
+      </w:r>
+      <w:r>
+        <w:t xml:space="preserve">Wallace H. Coulter Department of Biomedical Engineering, Emory University and Georgia Institute of Technology.</w:t>
+      </w:r>
+    </w:p>
+    <w:p>
+      <w:pPr>
+        <w:pStyle w:val="Compact"/>
+        <w:numPr>
+          <w:ilvl w:val="0"/>
+          <w:numId w:val="1001"/>
+        </w:numPr>
+      </w:pPr>
+      <w:r>
+        <w:rPr>
+          <w:b/>
+          <w:bCs/>
+        </w:rPr>
+        <w:t xml:space="preserve">Georgia Research Alliance Phase 1 Grant:</w:t>
+      </w:r>
+      <w:r>
+        <w:t xml:space="preserve"> </w:t>
+      </w:r>
+      <w:r>
+        <w:t xml:space="preserve">$50,000 commercialization award for ARiSe retinal risk assessment prototype development, 2025. Role: Co-Investigator / Key Technical Lead.</w:t>
+      </w:r>
+    </w:p>
+    <w:p>
+      <w:pPr>
+        <w:pStyle w:val="Compact"/>
+        <w:numPr>
+          <w:ilvl w:val="0"/>
+          <w:numId w:val="1001"/>
+        </w:numPr>
+      </w:pPr>
+      <w:r>
+        <w:rPr>
+          <w:b/>
+          <w:bCs/>
+        </w:rPr>
+        <w:t xml:space="preserve">Graduate Scholarship Recipient:</w:t>
+      </w:r>
+      <w:r>
+        <w:t xml:space="preserve"> </w:t>
+      </w:r>
+      <w:r>
+        <w:t xml:space="preserve">Rochester Institute of Technology, MS in Computer Engineering.</w:t>
+      </w:r>
+    </w:p>
+    <w:p>
+      <w:pPr>
+        <w:pStyle w:val="Compact"/>
+        <w:numPr>
+          <w:ilvl w:val="0"/>
+          <w:numId w:val="1001"/>
+        </w:numPr>
+      </w:pPr>
+      <w:r>
+        <w:rPr>
+          <w:b/>
+          <w:bCs/>
+        </w:rPr>
+        <w:t xml:space="preserve">Best Outgoing Student:</w:t>
+      </w:r>
+      <w:r>
+        <w:t xml:space="preserve"> </w:t>
+      </w:r>
+      <w:r>
+        <w:t xml:space="preserve">ECE Department, MIT College of Engineering, Pune University.</w:t>
+      </w:r>
+    </w:p>
+    <w:bookmarkEnd w:id="15"/>
+    <w:bookmarkStart w:id="16" w:name="research-appointments"/>
+    <w:p>
+      <w:pPr>
+        <w:pStyle w:val="Heading2"/>
+      </w:pPr>
+      <w:r>
         <w:t xml:space="preserve">Research Appointments</w:t>
       </w:r>
     </w:p>
@@ -237,7 +335,7 @@
         <w:pStyle w:val="Compact"/>
         <w:numPr>
           <w:ilvl w:val="0"/>
-          <w:numId w:val="1001"/>
+          <w:numId w:val="1002"/>
         </w:numPr>
       </w:pPr>
       <w:r>
@@ -249,7 +347,7 @@
         <w:pStyle w:val="Compact"/>
         <w:numPr>
           <w:ilvl w:val="0"/>
-          <w:numId w:val="1001"/>
+          <w:numId w:val="1002"/>
         </w:numPr>
       </w:pPr>
       <w:r>
@@ -261,7 +359,7 @@
         <w:pStyle w:val="Compact"/>
         <w:numPr>
           <w:ilvl w:val="0"/>
-          <w:numId w:val="1001"/>
+          <w:numId w:val="1002"/>
         </w:numPr>
       </w:pPr>
       <w:r>
@@ -273,7 +371,7 @@
         <w:pStyle w:val="Compact"/>
         <w:numPr>
           <w:ilvl w:val="0"/>
-          <w:numId w:val="1001"/>
+          <w:numId w:val="1002"/>
         </w:numPr>
       </w:pPr>
       <w:r>
@@ -285,7 +383,7 @@
         <w:pStyle w:val="Compact"/>
         <w:numPr>
           <w:ilvl w:val="0"/>
-          <w:numId w:val="1001"/>
+          <w:numId w:val="1002"/>
         </w:numPr>
       </w:pPr>
       <w:r>
@@ -315,7 +413,7 @@
         <w:pStyle w:val="Compact"/>
         <w:numPr>
           <w:ilvl w:val="0"/>
-          <w:numId w:val="1002"/>
+          <w:numId w:val="1003"/>
         </w:numPr>
       </w:pPr>
       <w:r>
@@ -327,7 +425,7 @@
         <w:pStyle w:val="Compact"/>
         <w:numPr>
           <w:ilvl w:val="0"/>
-          <w:numId w:val="1002"/>
+          <w:numId w:val="1003"/>
         </w:numPr>
       </w:pPr>
       <w:r>
@@ -339,7 +437,7 @@
         <w:pStyle w:val="Compact"/>
         <w:numPr>
           <w:ilvl w:val="0"/>
-          <w:numId w:val="1002"/>
+          <w:numId w:val="1003"/>
         </w:numPr>
       </w:pPr>
       <w:r>
@@ -369,7 +467,7 @@
         <w:pStyle w:val="Compact"/>
         <w:numPr>
           <w:ilvl w:val="0"/>
-          <w:numId w:val="1003"/>
+          <w:numId w:val="1004"/>
         </w:numPr>
       </w:pPr>
       <w:r>
@@ -381,15 +479,15 @@
         <w:pStyle w:val="Compact"/>
         <w:numPr>
           <w:ilvl w:val="0"/>
-          <w:numId w:val="1003"/>
+          <w:numId w:val="1004"/>
         </w:numPr>
       </w:pPr>
       <w:r>
         <w:t xml:space="preserve">Collaborated with VisualDx Inc. on machine learning methods for clinical skin lesion diagnosis.</w:t>
       </w:r>
     </w:p>
-    <w:bookmarkEnd w:id="15"/>
-    <w:bookmarkStart w:id="16" w:name="Xb509794b258e44d0bcfe3701c338e9b143ab646"/>
+    <w:bookmarkEnd w:id="16"/>
+    <w:bookmarkStart w:id="17" w:name="Xb509794b258e44d0bcfe3701c338e9b143ab646"/>
     <w:p>
       <w:pPr>
         <w:pStyle w:val="Heading2"/>
@@ -421,7 +519,7 @@
         <w:pStyle w:val="Compact"/>
         <w:numPr>
           <w:ilvl w:val="0"/>
-          <w:numId w:val="1004"/>
+          <w:numId w:val="1005"/>
         </w:numPr>
       </w:pPr>
       <w:r>
@@ -433,7 +531,7 @@
         <w:pStyle w:val="Compact"/>
         <w:numPr>
           <w:ilvl w:val="0"/>
-          <w:numId w:val="1004"/>
+          <w:numId w:val="1005"/>
         </w:numPr>
       </w:pPr>
       <w:r>
@@ -463,7 +561,7 @@
         <w:pStyle w:val="Compact"/>
         <w:numPr>
           <w:ilvl w:val="0"/>
-          <w:numId w:val="1005"/>
+          <w:numId w:val="1006"/>
         </w:numPr>
       </w:pPr>
       <w:r>
@@ -475,15 +573,15 @@
         <w:pStyle w:val="Compact"/>
         <w:numPr>
           <w:ilvl w:val="0"/>
-          <w:numId w:val="1005"/>
+          <w:numId w:val="1006"/>
         </w:numPr>
       </w:pPr>
       <w:r>
         <w:t xml:space="preserve">Built semi-supervised workflows using limited labeled data and deployed large-scale automated counting pipelines for geospatial analysis.</w:t>
       </w:r>
     </w:p>
-    <w:bookmarkEnd w:id="16"/>
-    <w:bookmarkStart w:id="18" w:name="Xbbdfc735e8d5bb41984e8700218d7114c01c550"/>
+    <w:bookmarkEnd w:id="17"/>
+    <w:bookmarkStart w:id="19" w:name="Xbbdfc735e8d5bb41984e8700218d7114c01c550"/>
     <w:p>
       <w:pPr>
         <w:pStyle w:val="Heading2"/>
@@ -497,7 +595,7 @@
         <w:pStyle w:val="Compact"/>
         <w:numPr>
           <w:ilvl w:val="0"/>
-          <w:numId w:val="1006"/>
+          <w:numId w:val="1007"/>
         </w:numPr>
       </w:pPr>
       <w:r>
@@ -535,7 +633,7 @@
         <w:pStyle w:val="Compact"/>
         <w:numPr>
           <w:ilvl w:val="0"/>
-          <w:numId w:val="1006"/>
+          <w:numId w:val="1007"/>
         </w:numPr>
       </w:pPr>
       <w:r>
@@ -567,7 +665,7 @@
         <w:pStyle w:val="Compact"/>
         <w:numPr>
           <w:ilvl w:val="0"/>
-          <w:numId w:val="1006"/>
+          <w:numId w:val="1007"/>
         </w:numPr>
       </w:pPr>
       <w:r>
@@ -599,7 +697,7 @@
         <w:pStyle w:val="Compact"/>
         <w:numPr>
           <w:ilvl w:val="0"/>
-          <w:numId w:val="1006"/>
+          <w:numId w:val="1007"/>
         </w:numPr>
       </w:pPr>
       <w:r>
@@ -637,7 +735,7 @@
         <w:pStyle w:val="Compact"/>
         <w:numPr>
           <w:ilvl w:val="0"/>
-          <w:numId w:val="1006"/>
+          <w:numId w:val="1007"/>
         </w:numPr>
       </w:pPr>
       <w:r>
@@ -669,7 +767,7 @@
         <w:pStyle w:val="Compact"/>
         <w:numPr>
           <w:ilvl w:val="0"/>
-          <w:numId w:val="1006"/>
+          <w:numId w:val="1007"/>
         </w:numPr>
       </w:pPr>
       <w:r>
@@ -707,7 +805,7 @@
         <w:pStyle w:val="Compact"/>
         <w:numPr>
           <w:ilvl w:val="0"/>
-          <w:numId w:val="1006"/>
+          <w:numId w:val="1007"/>
         </w:numPr>
       </w:pPr>
       <w:r>
@@ -739,7 +837,7 @@
         <w:pStyle w:val="Compact"/>
         <w:numPr>
           <w:ilvl w:val="0"/>
-          <w:numId w:val="1006"/>
+          <w:numId w:val="1007"/>
         </w:numPr>
       </w:pPr>
       <w:r>
@@ -777,7 +875,7 @@
         <w:pStyle w:val="Compact"/>
         <w:numPr>
           <w:ilvl w:val="0"/>
-          <w:numId w:val="1006"/>
+          <w:numId w:val="1007"/>
         </w:numPr>
       </w:pPr>
       <w:r>
@@ -815,7 +913,7 @@
         <w:pStyle w:val="Compact"/>
         <w:numPr>
           <w:ilvl w:val="0"/>
-          <w:numId w:val="1006"/>
+          <w:numId w:val="1007"/>
         </w:numPr>
       </w:pPr>
       <w:r>
@@ -858,7 +956,7 @@
       <w:r>
         <w:t xml:space="preserve"> </w:t>
       </w:r>
-      <w:hyperlink r:id="rId17">
+      <w:hyperlink r:id="rId18">
         <w:r>
           <w:rPr>
             <w:rStyle w:val="Hyperlink"/>
@@ -867,8 +965,8 @@
         </w:r>
       </w:hyperlink>
     </w:p>
-    <w:bookmarkEnd w:id="18"/>
-    <w:bookmarkStart w:id="19" w:name="X05c9b9fa34b0fc6bcc7719e77e8103731329624"/>
+    <w:bookmarkEnd w:id="19"/>
+    <w:bookmarkStart w:id="20" w:name="X05c9b9fa34b0fc6bcc7719e77e8103731329624"/>
     <w:p>
       <w:pPr>
         <w:pStyle w:val="Heading2"/>
@@ -882,7 +980,7 @@
         <w:pStyle w:val="Compact"/>
         <w:numPr>
           <w:ilvl w:val="0"/>
-          <w:numId w:val="1007"/>
+          <w:numId w:val="1008"/>
         </w:numPr>
       </w:pPr>
       <w:r>
@@ -917,7 +1015,7 @@
         <w:pStyle w:val="Compact"/>
         <w:numPr>
           <w:ilvl w:val="0"/>
-          <w:numId w:val="1007"/>
+          <w:numId w:val="1008"/>
         </w:numPr>
       </w:pPr>
       <w:r>
@@ -952,7 +1050,7 @@
         <w:pStyle w:val="Compact"/>
         <w:numPr>
           <w:ilvl w:val="0"/>
-          <w:numId w:val="1007"/>
+          <w:numId w:val="1008"/>
         </w:numPr>
       </w:pPr>
       <w:r>
@@ -987,7 +1085,7 @@
         <w:pStyle w:val="Compact"/>
         <w:numPr>
           <w:ilvl w:val="0"/>
-          <w:numId w:val="1007"/>
+          <w:numId w:val="1008"/>
         </w:numPr>
       </w:pPr>
       <w:r>
@@ -1004,8 +1102,8 @@
         <w:t xml:space="preserve">$50,000 commercialization award for ARiSe retinal risk assessment prototype development, 2025. Role: Co-Investigator / Key Technical Lead.</w:t>
       </w:r>
     </w:p>
-    <w:bookmarkEnd w:id="19"/>
-    <w:bookmarkStart w:id="20" w:name="teaching-mentoring-and-leadership"/>
+    <w:bookmarkEnd w:id="20"/>
+    <w:bookmarkStart w:id="21" w:name="teaching-mentoring-and-leadership"/>
     <w:p>
       <w:pPr>
         <w:pStyle w:val="Heading2"/>
@@ -1037,7 +1135,7 @@
         <w:pStyle w:val="Compact"/>
         <w:numPr>
           <w:ilvl w:val="0"/>
-          <w:numId w:val="1008"/>
+          <w:numId w:val="1009"/>
         </w:numPr>
       </w:pPr>
       <w:r>
@@ -1049,7 +1147,7 @@
         <w:pStyle w:val="Compact"/>
         <w:numPr>
           <w:ilvl w:val="0"/>
-          <w:numId w:val="1008"/>
+          <w:numId w:val="1009"/>
         </w:numPr>
       </w:pPr>
       <w:r>
@@ -1061,7 +1159,7 @@
         <w:pStyle w:val="Compact"/>
         <w:numPr>
           <w:ilvl w:val="0"/>
-          <w:numId w:val="1008"/>
+          <w:numId w:val="1009"/>
         </w:numPr>
       </w:pPr>
       <w:r>
@@ -1085,7 +1183,7 @@
         <w:pStyle w:val="Compact"/>
         <w:numPr>
           <w:ilvl w:val="0"/>
-          <w:numId w:val="1009"/>
+          <w:numId w:val="1010"/>
         </w:numPr>
       </w:pPr>
       <w:r>
@@ -1097,7 +1195,7 @@
         <w:pStyle w:val="Compact"/>
         <w:numPr>
           <w:ilvl w:val="0"/>
-          <w:numId w:val="1009"/>
+          <w:numId w:val="1010"/>
         </w:numPr>
       </w:pPr>
       <w:r>
@@ -1109,15 +1207,15 @@
         <w:pStyle w:val="Compact"/>
         <w:numPr>
           <w:ilvl w:val="0"/>
-          <w:numId w:val="1009"/>
+          <w:numId w:val="1010"/>
         </w:numPr>
       </w:pPr>
       <w:r>
         <w:t xml:space="preserve">Mentored junior researchers on medical data validation, reproducible analysis, model evaluation, and interpretation of clinical AI models.</w:t>
       </w:r>
     </w:p>
-    <w:bookmarkEnd w:id="20"/>
-    <w:bookmarkStart w:id="21" w:name="technical-skills"/>
+    <w:bookmarkEnd w:id="21"/>
+    <w:bookmarkStart w:id="22" w:name="technical-skills"/>
     <w:p>
       <w:pPr>
         <w:pStyle w:val="Heading2"/>
@@ -1131,7 +1229,7 @@
         <w:pStyle w:val="Compact"/>
         <w:numPr>
           <w:ilvl w:val="0"/>
-          <w:numId w:val="1010"/>
+          <w:numId w:val="1011"/>
         </w:numPr>
       </w:pPr>
       <w:r>
@@ -1153,7 +1251,7 @@
         <w:pStyle w:val="Compact"/>
         <w:numPr>
           <w:ilvl w:val="0"/>
-          <w:numId w:val="1010"/>
+          <w:numId w:val="1011"/>
         </w:numPr>
       </w:pPr>
       <w:r>
@@ -1175,7 +1273,7 @@
         <w:pStyle w:val="Compact"/>
         <w:numPr>
           <w:ilvl w:val="0"/>
-          <w:numId w:val="1010"/>
+          <w:numId w:val="1011"/>
         </w:numPr>
       </w:pPr>
       <w:r>
@@ -1197,7 +1295,7 @@
         <w:pStyle w:val="Compact"/>
         <w:numPr>
           <w:ilvl w:val="0"/>
-          <w:numId w:val="1010"/>
+          <w:numId w:val="1011"/>
         </w:numPr>
       </w:pPr>
       <w:r>
@@ -1214,8 +1312,8 @@
         <w:t xml:space="preserve">Cohort curation, model validation, Kaplan-Meier analysis, Cox modeling, concordance index, ablation studies, clinical collaborator-facing reporting.</w:t>
       </w:r>
     </w:p>
-    <w:bookmarkEnd w:id="21"/>
-    <w:bookmarkStart w:id="22" w:name="media-and-recognition"/>
+    <w:bookmarkEnd w:id="22"/>
+    <w:bookmarkStart w:id="23" w:name="media-and-recognition"/>
     <w:p>
       <w:pPr>
         <w:pStyle w:val="Heading2"/>
@@ -1229,7 +1327,7 @@
         <w:pStyle w:val="Compact"/>
         <w:numPr>
           <w:ilvl w:val="0"/>
-          <w:numId w:val="1011"/>
+          <w:numId w:val="1012"/>
         </w:numPr>
       </w:pPr>
       <w:r>
@@ -1249,8 +1347,8 @@
         <w:t xml:space="preserve">, Summer 2025, for AI-enabled retinal imaging work in cardiovascular risk assessment.</w:t>
       </w:r>
     </w:p>
-    <w:bookmarkEnd w:id="22"/>
     <w:bookmarkEnd w:id="23"/>
+    <w:bookmarkEnd w:id="24"/>
     <w:sectPr>
       <w:footnotePr>
         <w:numRestart w:val="eachSect"/>
@@ -1568,6 +1666,9 @@
     <w:abstractNumId w:val="991"/>
   </w:num>
   <w:num w:numId="1006">
+    <w:abstractNumId w:val="991"/>
+  </w:num>
+  <w:num w:numId="1007">
     <w:abstractNumId w:val="99411"/>
     <w:lvlOverride w:ilvl="0">
       <w:startOverride w:val="1"/>
@@ -1597,9 +1698,6 @@
       <w:startOverride w:val="1"/>
     </w:lvlOverride>
   </w:num>
-  <w:num w:numId="1007">
-    <w:abstractNumId w:val="991"/>
-  </w:num>
   <w:num w:numId="1008">
     <w:abstractNumId w:val="991"/>
   </w:num>
@@ -1610,6 +1708,9 @@
     <w:abstractNumId w:val="991"/>
   </w:num>
   <w:num w:numId="1011">
+    <w:abstractNumId w:val="991"/>
+  </w:num>
+  <w:num w:numId="1012">
     <w:abstractNumId w:val="991"/>
   </w:num>
 </w:numbering>
@@ -2271,7 +2372,7 @@
       <w:color w:themeColor="accent1" w:themeShade="BF" w:val="365F91"/>
     </w:rPr>
   </w:style>
-  <w:style w:type="paragraph" w:customStyle="1" w:styleId="SourceCode">
+  <w:style w:customStyle="1" w:styleId="SourceCode" w:type="paragraph">
     <w:name w:val="Source Code"/>
     <w:basedOn w:val="Normal"/>
     <w:link w:val="VerbatimChar"/>
@@ -2279,7 +2380,7 @@
       <w:wordWrap w:val="off"/>
     </w:pPr>
   </w:style>
-  <w:style w:type="character" w:customStyle="1" w:styleId="KeywordTok">
+  <w:style w:customStyle="1" w:styleId="KeywordTok" w:type="character">
     <w:name w:val="KeywordTok"/>
     <w:basedOn w:val="VerbatimChar"/>
     <w:rPr>
@@ -2287,77 +2388,77 @@
       <w:color w:val="007020"/>
     </w:rPr>
   </w:style>
-  <w:style w:type="character" w:customStyle="1" w:styleId="DataTypeTok">
+  <w:style w:customStyle="1" w:styleId="DataTypeTok" w:type="character">
     <w:name w:val="DataTypeTok"/>
     <w:basedOn w:val="VerbatimChar"/>
     <w:rPr>
       <w:color w:val="902000"/>
     </w:rPr>
   </w:style>
-  <w:style w:type="character" w:customStyle="1" w:styleId="DecValTok">
+  <w:style w:customStyle="1" w:styleId="DecValTok" w:type="character">
     <w:name w:val="DecValTok"/>
     <w:basedOn w:val="VerbatimChar"/>
     <w:rPr>
       <w:color w:val="40a070"/>
     </w:rPr>
   </w:style>
-  <w:style w:type="character" w:customStyle="1" w:styleId="BaseNTok">
+  <w:style w:customStyle="1" w:styleId="BaseNTok" w:type="character">
     <w:name w:val="BaseNTok"/>
     <w:basedOn w:val="VerbatimChar"/>
     <w:rPr>
       <w:color w:val="40a070"/>
     </w:rPr>
   </w:style>
-  <w:style w:type="character" w:customStyle="1" w:styleId="FloatTok">
+  <w:style w:customStyle="1" w:styleId="FloatTok" w:type="character">
     <w:name w:val="FloatTok"/>
     <w:basedOn w:val="VerbatimChar"/>
     <w:rPr>
       <w:color w:val="40a070"/>
     </w:rPr>
   </w:style>
-  <w:style w:type="character" w:customStyle="1" w:styleId="ConstantTok">
+  <w:style w:customStyle="1" w:styleId="ConstantTok" w:type="character">
     <w:name w:val="ConstantTok"/>
     <w:basedOn w:val="VerbatimChar"/>
     <w:rPr>
       <w:color w:val="880000"/>
     </w:rPr>
   </w:style>
-  <w:style w:type="character" w:customStyle="1" w:styleId="CharTok">
+  <w:style w:customStyle="1" w:styleId="CharTok" w:type="character">
     <w:name w:val="CharTok"/>
     <w:basedOn w:val="VerbatimChar"/>
     <w:rPr>
       <w:color w:val="4070a0"/>
     </w:rPr>
   </w:style>
-  <w:style w:type="character" w:customStyle="1" w:styleId="SpecialCharTok">
+  <w:style w:customStyle="1" w:styleId="SpecialCharTok" w:type="character">
     <w:name w:val="SpecialCharTok"/>
     <w:basedOn w:val="VerbatimChar"/>
     <w:rPr>
       <w:color w:val="4070a0"/>
     </w:rPr>
   </w:style>
-  <w:style w:type="character" w:customStyle="1" w:styleId="StringTok">
+  <w:style w:customStyle="1" w:styleId="StringTok" w:type="character">
     <w:name w:val="StringTok"/>
     <w:basedOn w:val="VerbatimChar"/>
     <w:rPr>
       <w:color w:val="4070a0"/>
     </w:rPr>
   </w:style>
-  <w:style w:type="character" w:customStyle="1" w:styleId="VerbatimStringTok">
+  <w:style w:customStyle="1" w:styleId="VerbatimStringTok" w:type="character">
     <w:name w:val="VerbatimStringTok"/>
     <w:basedOn w:val="VerbatimChar"/>
     <w:rPr>
       <w:color w:val="4070a0"/>
     </w:rPr>
   </w:style>
-  <w:style w:type="character" w:customStyle="1" w:styleId="SpecialStringTok">
+  <w:style w:customStyle="1" w:styleId="SpecialStringTok" w:type="character">
     <w:name w:val="SpecialStringTok"/>
     <w:basedOn w:val="VerbatimChar"/>
     <w:rPr>
       <w:color w:val="bb6688"/>
     </w:rPr>
   </w:style>
-  <w:style w:type="character" w:customStyle="1" w:styleId="ImportTok">
+  <w:style w:customStyle="1" w:styleId="ImportTok" w:type="character">
     <w:name w:val="ImportTok"/>
     <w:basedOn w:val="VerbatimChar"/>
     <w:rPr>
@@ -2365,7 +2466,7 @@
       <w:color w:val="008000"/>
     </w:rPr>
   </w:style>
-  <w:style w:type="character" w:customStyle="1" w:styleId="CommentTok">
+  <w:style w:customStyle="1" w:styleId="CommentTok" w:type="character">
     <w:name w:val="CommentTok"/>
     <w:basedOn w:val="VerbatimChar"/>
     <w:rPr>
@@ -2373,7 +2474,7 @@
       <w:color w:val="60a0b0"/>
     </w:rPr>
   </w:style>
-  <w:style w:type="character" w:customStyle="1" w:styleId="DocumentationTok">
+  <w:style w:customStyle="1" w:styleId="DocumentationTok" w:type="character">
     <w:name w:val="DocumentationTok"/>
     <w:basedOn w:val="VerbatimChar"/>
     <w:rPr>
@@ -2381,7 +2482,7 @@
       <w:color w:val="ba2121"/>
     </w:rPr>
   </w:style>
-  <w:style w:type="character" w:customStyle="1" w:styleId="AnnotationTok">
+  <w:style w:customStyle="1" w:styleId="AnnotationTok" w:type="character">
     <w:name w:val="AnnotationTok"/>
     <w:basedOn w:val="VerbatimChar"/>
     <w:rPr>
@@ -2390,7 +2491,7 @@
       <w:color w:val="60a0b0"/>
     </w:rPr>
   </w:style>
-  <w:style w:type="character" w:customStyle="1" w:styleId="CommentVarTok">
+  <w:style w:customStyle="1" w:styleId="CommentVarTok" w:type="character">
     <w:name w:val="CommentVarTok"/>
     <w:basedOn w:val="VerbatimChar"/>
     <w:rPr>
@@ -2399,28 +2500,28 @@
       <w:color w:val="60a0b0"/>
     </w:rPr>
   </w:style>
-  <w:style w:type="character" w:customStyle="1" w:styleId="OtherTok">
+  <w:style w:customStyle="1" w:styleId="OtherTok" w:type="character">
     <w:name w:val="OtherTok"/>
     <w:basedOn w:val="VerbatimChar"/>
     <w:rPr>
       <w:color w:val="007020"/>
     </w:rPr>
   </w:style>
-  <w:style w:type="character" w:customStyle="1" w:styleId="FunctionTok">
+  <w:style w:customStyle="1" w:styleId="FunctionTok" w:type="character">
     <w:name w:val="FunctionTok"/>
     <w:basedOn w:val="VerbatimChar"/>
     <w:rPr>
       <w:color w:val="06287e"/>
     </w:rPr>
   </w:style>
-  <w:style w:type="character" w:customStyle="1" w:styleId="VariableTok">
+  <w:style w:customStyle="1" w:styleId="VariableTok" w:type="character">
     <w:name w:val="VariableTok"/>
     <w:basedOn w:val="VerbatimChar"/>
     <w:rPr>
       <w:color w:val="19177c"/>
     </w:rPr>
   </w:style>
-  <w:style w:type="character" w:customStyle="1" w:styleId="ControlFlowTok">
+  <w:style w:customStyle="1" w:styleId="ControlFlowTok" w:type="character">
     <w:name w:val="ControlFlowTok"/>
     <w:basedOn w:val="VerbatimChar"/>
     <w:rPr>
@@ -2428,45 +2529,45 @@
       <w:color w:val="007020"/>
     </w:rPr>
   </w:style>
-  <w:style w:type="character" w:customStyle="1" w:styleId="OperatorTok">
+  <w:style w:customStyle="1" w:styleId="OperatorTok" w:type="character">
     <w:name w:val="OperatorTok"/>
     <w:basedOn w:val="VerbatimChar"/>
     <w:rPr>
       <w:color w:val="666666"/>
     </w:rPr>
   </w:style>
-  <w:style w:type="character" w:customStyle="1" w:styleId="BuiltInTok">
+  <w:style w:customStyle="1" w:styleId="BuiltInTok" w:type="character">
     <w:name w:val="BuiltInTok"/>
     <w:basedOn w:val="VerbatimChar"/>
     <w:rPr>
       <w:color w:val="008000"/>
     </w:rPr>
   </w:style>
-  <w:style w:type="character" w:customStyle="1" w:styleId="ExtensionTok">
+  <w:style w:customStyle="1" w:styleId="ExtensionTok" w:type="character">
     <w:name w:val="ExtensionTok"/>
     <w:basedOn w:val="VerbatimChar"/>
     <w:rPr/>
   </w:style>
-  <w:style w:type="character" w:customStyle="1" w:styleId="PreprocessorTok">
+  <w:style w:customStyle="1" w:styleId="PreprocessorTok" w:type="character">
     <w:name w:val="PreprocessorTok"/>
     <w:basedOn w:val="VerbatimChar"/>
     <w:rPr>
       <w:color w:val="bc7a00"/>
     </w:rPr>
   </w:style>
-  <w:style w:type="character" w:customStyle="1" w:styleId="AttributeTok">
+  <w:style w:customStyle="1" w:styleId="AttributeTok" w:type="character">
     <w:name w:val="AttributeTok"/>
     <w:basedOn w:val="VerbatimChar"/>
     <w:rPr>
       <w:color w:val="7d9029"/>
     </w:rPr>
   </w:style>
-  <w:style w:type="character" w:customStyle="1" w:styleId="RegionMarkerTok">
+  <w:style w:customStyle="1" w:styleId="RegionMarkerTok" w:type="character">
     <w:name w:val="RegionMarkerTok"/>
     <w:basedOn w:val="VerbatimChar"/>
     <w:rPr/>
   </w:style>
-  <w:style w:type="character" w:customStyle="1" w:styleId="InformationTok">
+  <w:style w:customStyle="1" w:styleId="InformationTok" w:type="character">
     <w:name w:val="InformationTok"/>
     <w:basedOn w:val="VerbatimChar"/>
     <w:rPr>
@@ -2475,7 +2576,7 @@
       <w:color w:val="60a0b0"/>
     </w:rPr>
   </w:style>
-  <w:style w:type="character" w:customStyle="1" w:styleId="WarningTok">
+  <w:style w:customStyle="1" w:styleId="WarningTok" w:type="character">
     <w:name w:val="WarningTok"/>
     <w:basedOn w:val="VerbatimChar"/>
     <w:rPr>
@@ -2484,7 +2585,7 @@
       <w:color w:val="60a0b0"/>
     </w:rPr>
   </w:style>
-  <w:style w:type="character" w:customStyle="1" w:styleId="AlertTok">
+  <w:style w:customStyle="1" w:styleId="AlertTok" w:type="character">
     <w:name w:val="AlertTok"/>
     <w:basedOn w:val="VerbatimChar"/>
     <w:rPr>
@@ -2492,7 +2593,7 @@
       <w:color w:val="ff0000"/>
     </w:rPr>
   </w:style>
-  <w:style w:type="character" w:customStyle="1" w:styleId="ErrorTok">
+  <w:style w:customStyle="1" w:styleId="ErrorTok" w:type="character">
     <w:name w:val="ErrorTok"/>
     <w:basedOn w:val="VerbatimChar"/>
     <w:rPr>
@@ -2500,7 +2601,7 @@
       <w:color w:val="ff0000"/>
     </w:rPr>
   </w:style>
-  <w:style w:type="character" w:customStyle="1" w:styleId="NormalTok">
+  <w:style w:customStyle="1" w:styleId="NormalTok" w:type="character">
     <w:name w:val="NormalTok"/>
     <w:basedOn w:val="VerbatimChar"/>
     <w:rPr/>

</xml_diff>